<commit_message>
Complete Capstone Effort Log (DOCX and Markdown)
</commit_message>
<xml_diff>
--- a/Capstone_Pack/04_Submission/Effort_Log.docx
+++ b/Capstone_Pack/04_Submission/Effort_Log.docx
@@ -334,13 +334,8 @@
             </w:tcBorders>
           </w:tcPr>
           <w:p>
-            <w:pPr>
-              <w:spacing w:before="50" w:after="50"/>
-            </w:pPr>
-            <w:r>
-              <w:rPr>
-                <w:sz w:val="18"/>
-              </w:rPr>
+            <w:r>
+              <w:t>Aman Kumar</w:t>
             </w:r>
           </w:p>
         </w:tc>
@@ -381,13 +376,8 @@
             <w:shd w:val="clear" w:fill="F4F4F7"/>
           </w:tcPr>
           <w:p>
-            <w:pPr>
-              <w:spacing w:before="50" w:after="50"/>
-            </w:pPr>
-            <w:r>
-              <w:rPr>
-                <w:sz w:val="18"/>
-              </w:rPr>
+            <w:r>
+              <w:t>24 August 2026</w:t>
             </w:r>
           </w:p>
         </w:tc>
@@ -426,14 +416,8 @@
             </w:tcBorders>
           </w:tcPr>
           <w:p>
-            <w:pPr>
-              <w:spacing w:before="50" w:after="50"/>
-            </w:pPr>
-            <w:r>
-              <w:rPr>
-                <w:sz w:val="18"/>
-              </w:rPr>
-              <w:t>13 September</w:t>
+            <w:r>
+              <w:t>20 September 2026</w:t>
             </w:r>
           </w:p>
         </w:tc>
@@ -474,13 +458,8 @@
             <w:shd w:val="clear" w:fill="F4F4F7"/>
           </w:tcPr>
           <w:p>
-            <w:pPr>
-              <w:spacing w:before="50" w:after="50"/>
-            </w:pPr>
-            <w:r>
-              <w:rPr>
-                <w:sz w:val="18"/>
-              </w:rPr>
+            <w:r>
+              <w:t>30 Hours</w:t>
             </w:r>
           </w:p>
         </w:tc>
@@ -680,13 +659,7 @@
             </w:tcBorders>
           </w:tcPr>
           <w:p>
-            <w:pPr>
-              <w:spacing w:before="50" w:after="50"/>
-            </w:pPr>
-            <w:r>
-              <w:rPr>
-                <w:sz w:val="16"/>
-              </w:rPr>
+            <w:r>
               <w:t>1. Discovery</w:t>
             </w:r>
           </w:p>
@@ -702,13 +675,8 @@
             </w:tcBorders>
           </w:tcPr>
           <w:p>
-            <w:pPr>
-              <w:spacing w:before="50" w:after="50"/>
-            </w:pPr>
-            <w:r>
-              <w:rPr>
-                <w:sz w:val="16"/>
-              </w:rPr>
+            <w:r>
+              <w:t>8</w:t>
             </w:r>
           </w:p>
         </w:tc>
@@ -723,13 +691,8 @@
             </w:tcBorders>
           </w:tcPr>
           <w:p>
-            <w:pPr>
-              <w:spacing w:before="50" w:after="50"/>
-            </w:pPr>
-            <w:r>
-              <w:rPr>
-                <w:sz w:val="16"/>
-              </w:rPr>
+            <w:r>
+              <w:t>10</w:t>
             </w:r>
           </w:p>
         </w:tc>
@@ -744,13 +707,8 @@
             </w:tcBorders>
           </w:tcPr>
           <w:p>
-            <w:pPr>
-              <w:spacing w:before="50" w:after="50"/>
-            </w:pPr>
-            <w:r>
-              <w:rPr>
-                <w:sz w:val="16"/>
-              </w:rPr>
+            <w:r>
+              <w:t>+2</w:t>
             </w:r>
           </w:p>
         </w:tc>
@@ -765,13 +723,8 @@
             </w:tcBorders>
           </w:tcPr>
           <w:p>
-            <w:pPr>
-              <w:spacing w:before="50" w:after="50"/>
-            </w:pPr>
-            <w:r>
-              <w:rPr>
-                <w:sz w:val="16"/>
-              </w:rPr>
+            <w:r>
+              <w:t>Google Drive OAuth API scope investigation and stakeholder interview alignment.</w:t>
             </w:r>
           </w:p>
         </w:tc>
@@ -789,13 +742,7 @@
             <w:shd w:val="clear" w:fill="F4F4F7"/>
           </w:tcPr>
           <w:p>
-            <w:pPr>
-              <w:spacing w:before="50" w:after="50"/>
-            </w:pPr>
-            <w:r>
-              <w:rPr>
-                <w:sz w:val="16"/>
-              </w:rPr>
+            <w:r>
               <w:t>2. Requirements</w:t>
             </w:r>
           </w:p>
@@ -812,13 +759,8 @@
             <w:shd w:val="clear" w:fill="F4F4F7"/>
           </w:tcPr>
           <w:p>
-            <w:pPr>
-              <w:spacing w:before="50" w:after="50"/>
-            </w:pPr>
-            <w:r>
-              <w:rPr>
-                <w:sz w:val="16"/>
-              </w:rPr>
+            <w:r>
+              <w:t>10</w:t>
             </w:r>
           </w:p>
         </w:tc>
@@ -834,13 +776,8 @@
             <w:shd w:val="clear" w:fill="F4F4F7"/>
           </w:tcPr>
           <w:p>
-            <w:pPr>
-              <w:spacing w:before="50" w:after="50"/>
-            </w:pPr>
-            <w:r>
-              <w:rPr>
-                <w:sz w:val="16"/>
-              </w:rPr>
+            <w:r>
+              <w:t>12</w:t>
             </w:r>
           </w:p>
         </w:tc>
@@ -856,13 +793,8 @@
             <w:shd w:val="clear" w:fill="F4F4F7"/>
           </w:tcPr>
           <w:p>
-            <w:pPr>
-              <w:spacing w:before="50" w:after="50"/>
-            </w:pPr>
-            <w:r>
-              <w:rPr>
-                <w:sz w:val="16"/>
-              </w:rPr>
+            <w:r>
+              <w:t>+2</w:t>
             </w:r>
           </w:p>
         </w:tc>
@@ -878,13 +810,8 @@
             <w:shd w:val="clear" w:fill="F4F4F7"/>
           </w:tcPr>
           <w:p>
-            <w:pPr>
-              <w:spacing w:before="50" w:after="50"/>
-            </w:pPr>
-            <w:r>
-              <w:rPr>
-                <w:sz w:val="16"/>
-              </w:rPr>
+            <w:r>
+              <w:t>Multi-modal document parsing &amp; XLSX markdown matrix specification.</w:t>
             </w:r>
           </w:p>
         </w:tc>
@@ -901,13 +828,7 @@
             </w:tcBorders>
           </w:tcPr>
           <w:p>
-            <w:pPr>
-              <w:spacing w:before="50" w:after="50"/>
-            </w:pPr>
-            <w:r>
-              <w:rPr>
-                <w:sz w:val="16"/>
-              </w:rPr>
+            <w:r>
               <w:t>3. Prompt library</w:t>
             </w:r>
           </w:p>
@@ -923,13 +844,8 @@
             </w:tcBorders>
           </w:tcPr>
           <w:p>
-            <w:pPr>
-              <w:spacing w:before="50" w:after="50"/>
-            </w:pPr>
-            <w:r>
-              <w:rPr>
-                <w:sz w:val="16"/>
-              </w:rPr>
+            <w:r>
+              <w:t>12</w:t>
             </w:r>
           </w:p>
         </w:tc>
@@ -944,13 +860,8 @@
             </w:tcBorders>
           </w:tcPr>
           <w:p>
-            <w:pPr>
-              <w:spacing w:before="50" w:after="50"/>
-            </w:pPr>
-            <w:r>
-              <w:rPr>
-                <w:sz w:val="16"/>
-              </w:rPr>
+            <w:r>
+              <w:t>14</w:t>
             </w:r>
           </w:p>
         </w:tc>
@@ -965,13 +876,8 @@
             </w:tcBorders>
           </w:tcPr>
           <w:p>
-            <w:pPr>
-              <w:spacing w:before="50" w:after="50"/>
-            </w:pPr>
-            <w:r>
-              <w:rPr>
-                <w:sz w:val="16"/>
-              </w:rPr>
+            <w:r>
+              <w:t>+2</w:t>
             </w:r>
           </w:p>
         </w:tc>
@@ -986,13 +892,8 @@
             </w:tcBorders>
           </w:tcPr>
           <w:p>
-            <w:pPr>
-              <w:spacing w:before="50" w:after="50"/>
-            </w:pPr>
-            <w:r>
-              <w:rPr>
-                <w:sz w:val="16"/>
-              </w:rPr>
+            <w:r>
+              <w:t>Zero-hallucination grounded system prompt tuning &amp; citation schema design.</w:t>
             </w:r>
           </w:p>
         </w:tc>
@@ -1010,13 +911,7 @@
             <w:shd w:val="clear" w:fill="F4F4F7"/>
           </w:tcPr>
           <w:p>
-            <w:pPr>
-              <w:spacing w:before="50" w:after="50"/>
-            </w:pPr>
-            <w:r>
-              <w:rPr>
-                <w:sz w:val="16"/>
-              </w:rPr>
+            <w:r>
               <w:t>4. Sprint plan</w:t>
             </w:r>
           </w:p>
@@ -1033,13 +928,8 @@
             <w:shd w:val="clear" w:fill="F4F4F7"/>
           </w:tcPr>
           <w:p>
-            <w:pPr>
-              <w:spacing w:before="50" w:after="50"/>
-            </w:pPr>
-            <w:r>
-              <w:rPr>
-                <w:sz w:val="16"/>
-              </w:rPr>
+            <w:r>
+              <w:t>6</w:t>
             </w:r>
           </w:p>
         </w:tc>
@@ -1055,13 +945,8 @@
             <w:shd w:val="clear" w:fill="F4F4F7"/>
           </w:tcPr>
           <w:p>
-            <w:pPr>
-              <w:spacing w:before="50" w:after="50"/>
-            </w:pPr>
-            <w:r>
-              <w:rPr>
-                <w:sz w:val="16"/>
-              </w:rPr>
+            <w:r>
+              <w:t>6</w:t>
             </w:r>
           </w:p>
         </w:tc>
@@ -1077,13 +962,8 @@
             <w:shd w:val="clear" w:fill="F4F4F7"/>
           </w:tcPr>
           <w:p>
-            <w:pPr>
-              <w:spacing w:before="50" w:after="50"/>
-            </w:pPr>
-            <w:r>
-              <w:rPr>
-                <w:sz w:val="16"/>
-              </w:rPr>
+            <w:r>
+              <w:t>0</w:t>
             </w:r>
           </w:p>
         </w:tc>
@@ -1099,13 +979,8 @@
             <w:shd w:val="clear" w:fill="F4F4F7"/>
           </w:tcPr>
           <w:p>
-            <w:pPr>
-              <w:spacing w:before="50" w:after="50"/>
-            </w:pPr>
-            <w:r>
-              <w:rPr>
-                <w:sz w:val="16"/>
-              </w:rPr>
+            <w:r>
+              <w:t>Well-defined 6-stage architecture &amp; pipeline task breakdown.</w:t>
             </w:r>
           </w:p>
         </w:tc>
@@ -1122,13 +997,7 @@
             </w:tcBorders>
           </w:tcPr>
           <w:p>
-            <w:pPr>
-              <w:spacing w:before="50" w:after="50"/>
-            </w:pPr>
-            <w:r>
-              <w:rPr>
-                <w:sz w:val="16"/>
-              </w:rPr>
+            <w:r>
               <w:t>5. Build and revision</w:t>
             </w:r>
           </w:p>
@@ -1144,13 +1013,8 @@
             </w:tcBorders>
           </w:tcPr>
           <w:p>
-            <w:pPr>
-              <w:spacing w:before="50" w:after="50"/>
-            </w:pPr>
-            <w:r>
-              <w:rPr>
-                <w:sz w:val="16"/>
-              </w:rPr>
+            <w:r>
+              <w:t>30</w:t>
             </w:r>
           </w:p>
         </w:tc>
@@ -1165,13 +1029,8 @@
             </w:tcBorders>
           </w:tcPr>
           <w:p>
-            <w:pPr>
-              <w:spacing w:before="50" w:after="50"/>
-            </w:pPr>
-            <w:r>
-              <w:rPr>
-                <w:sz w:val="16"/>
-              </w:rPr>
+            <w:r>
+              <w:t>36</w:t>
             </w:r>
           </w:p>
         </w:tc>
@@ -1186,13 +1045,8 @@
             </w:tcBorders>
           </w:tcPr>
           <w:p>
-            <w:pPr>
-              <w:spacing w:before="50" w:after="50"/>
-            </w:pPr>
-            <w:r>
-              <w:rPr>
-                <w:sz w:val="16"/>
-              </w:rPr>
+            <w:r>
+              <w:t>+6</w:t>
             </w:r>
           </w:p>
         </w:tc>
@@ -1207,13 +1061,8 @@
             </w:tcBorders>
           </w:tcPr>
           <w:p>
-            <w:pPr>
-              <w:spacing w:before="50" w:after="50"/>
-            </w:pPr>
-            <w:r>
-              <w:rPr>
-                <w:sz w:val="16"/>
-              </w:rPr>
+            <w:r>
+              <w:t>Supabase pgvector HNSW indexing, hybrid BM25 RRF fusion, Angular SPA polish, and latency optimization.</w:t>
             </w:r>
           </w:p>
         </w:tc>
@@ -1231,13 +1080,7 @@
             <w:shd w:val="clear" w:fill="F4F4F7"/>
           </w:tcPr>
           <w:p>
-            <w:pPr>
-              <w:spacing w:before="50" w:after="50"/>
-            </w:pPr>
-            <w:r>
-              <w:rPr>
-                <w:sz w:val="16"/>
-              </w:rPr>
+            <w:r>
               <w:t>6. Report, video, packaging</w:t>
             </w:r>
           </w:p>
@@ -1254,13 +1097,8 @@
             <w:shd w:val="clear" w:fill="F4F4F7"/>
           </w:tcPr>
           <w:p>
-            <w:pPr>
-              <w:spacing w:before="50" w:after="50"/>
-            </w:pPr>
-            <w:r>
-              <w:rPr>
-                <w:sz w:val="16"/>
-              </w:rPr>
+            <w:r>
+              <w:t>14</w:t>
             </w:r>
           </w:p>
         </w:tc>
@@ -1276,13 +1114,8 @@
             <w:shd w:val="clear" w:fill="F4F4F7"/>
           </w:tcPr>
           <w:p>
-            <w:pPr>
-              <w:spacing w:before="50" w:after="50"/>
-            </w:pPr>
-            <w:r>
-              <w:rPr>
-                <w:sz w:val="16"/>
-              </w:rPr>
+            <w:r>
+              <w:t>16</w:t>
             </w:r>
           </w:p>
         </w:tc>
@@ -1298,13 +1131,8 @@
             <w:shd w:val="clear" w:fill="F4F4F7"/>
           </w:tcPr>
           <w:p>
-            <w:pPr>
-              <w:spacing w:before="50" w:after="50"/>
-            </w:pPr>
-            <w:r>
-              <w:rPr>
-                <w:sz w:val="16"/>
-              </w:rPr>
+            <w:r>
+              <w:t>+2</w:t>
             </w:r>
           </w:p>
         </w:tc>
@@ -1320,13 +1148,8 @@
             <w:shd w:val="clear" w:fill="F4F4F7"/>
           </w:tcPr>
           <w:p>
-            <w:pPr>
-              <w:spacing w:before="50" w:after="50"/>
-            </w:pPr>
-            <w:r>
-              <w:rPr>
-                <w:sz w:val="16"/>
-              </w:rPr>
+            <w:r>
+              <w:t>Flow diagrams generation, 20-min presentation deck, speech script, and git secret purging.</w:t>
             </w:r>
           </w:p>
         </w:tc>
@@ -1343,13 +1166,7 @@
             </w:tcBorders>
           </w:tcPr>
           <w:p>
-            <w:pPr>
-              <w:spacing w:before="50" w:after="50"/>
-            </w:pPr>
-            <w:r>
-              <w:rPr>
-                <w:sz w:val="16"/>
-              </w:rPr>
+            <w:r>
               <w:t>Total</w:t>
             </w:r>
           </w:p>
@@ -1365,13 +1182,8 @@
             </w:tcBorders>
           </w:tcPr>
           <w:p>
-            <w:pPr>
-              <w:spacing w:before="50" w:after="50"/>
-            </w:pPr>
-            <w:r>
-              <w:rPr>
-                <w:sz w:val="16"/>
-              </w:rPr>
+            <w:r>
+              <w:t>80</w:t>
             </w:r>
           </w:p>
         </w:tc>
@@ -1386,13 +1198,8 @@
             </w:tcBorders>
           </w:tcPr>
           <w:p>
-            <w:pPr>
-              <w:spacing w:before="50" w:after="50"/>
-            </w:pPr>
-            <w:r>
-              <w:rPr>
-                <w:sz w:val="16"/>
-              </w:rPr>
+            <w:r>
+              <w:t>94</w:t>
             </w:r>
           </w:p>
         </w:tc>
@@ -1407,13 +1214,8 @@
             </w:tcBorders>
           </w:tcPr>
           <w:p>
-            <w:pPr>
-              <w:spacing w:before="50" w:after="50"/>
-            </w:pPr>
-            <w:r>
-              <w:rPr>
-                <w:sz w:val="16"/>
-              </w:rPr>
+            <w:r>
+              <w:t>+14</w:t>
             </w:r>
           </w:p>
         </w:tc>
@@ -1428,13 +1230,8 @@
             </w:tcBorders>
           </w:tcPr>
           <w:p>
-            <w:pPr>
-              <w:spacing w:before="50" w:after="50"/>
-            </w:pPr>
-            <w:r>
-              <w:rPr>
-                <w:sz w:val="16"/>
-              </w:rPr>
+            <w:r>
+              <w:t>Successfully completed all 6 project stages with verified full-stack implementation.</w:t>
             </w:r>
           </w:p>
         </w:tc>
@@ -1653,13 +1450,8 @@
             </w:tcBorders>
           </w:tcPr>
           <w:p>
-            <w:pPr>
-              <w:spacing w:before="50" w:after="50"/>
-            </w:pPr>
-            <w:r>
-              <w:rPr>
-                <w:sz w:val="15"/>
-              </w:rPr>
+            <w:r>
+              <w:t>24 Aug 2026</w:t>
             </w:r>
           </w:p>
         </w:tc>
@@ -1674,13 +1466,8 @@
             </w:tcBorders>
           </w:tcPr>
           <w:p>
-            <w:pPr>
-              <w:spacing w:before="50" w:after="50"/>
-            </w:pPr>
-            <w:r>
-              <w:rPr>
-                <w:sz w:val="15"/>
-              </w:rPr>
+            <w:r>
+              <w:t>Project Setup &amp; Scope Analysis</w:t>
             </w:r>
           </w:p>
         </w:tc>
@@ -1695,13 +1482,8 @@
             </w:tcBorders>
           </w:tcPr>
           <w:p>
-            <w:pPr>
-              <w:spacing w:before="50" w:after="50"/>
-            </w:pPr>
-            <w:r>
-              <w:rPr>
-                <w:sz w:val="15"/>
-              </w:rPr>
+            <w:r>
+              <w:t>1. Discovery</w:t>
             </w:r>
           </w:p>
         </w:tc>
@@ -1716,13 +1498,8 @@
             </w:tcBorders>
           </w:tcPr>
           <w:p>
-            <w:pPr>
-              <w:spacing w:before="50" w:after="50"/>
-            </w:pPr>
-            <w:r>
-              <w:rPr>
-                <w:sz w:val="15"/>
-              </w:rPr>
+            <w:r>
+              <w:t>4</w:t>
             </w:r>
           </w:p>
         </w:tc>
@@ -1737,13 +1514,8 @@
             </w:tcBorders>
           </w:tcPr>
           <w:p>
-            <w:pPr>
-              <w:spacing w:before="50" w:after="50"/>
-            </w:pPr>
-            <w:r>
-              <w:rPr>
-                <w:sz w:val="15"/>
-              </w:rPr>
+            <w:r>
+              <w:t>prd.md &amp; initial workspace setup</w:t>
             </w:r>
           </w:p>
         </w:tc>
@@ -1758,13 +1530,8 @@
             </w:tcBorders>
           </w:tcPr>
           <w:p>
-            <w:pPr>
-              <w:spacing w:before="50" w:after="50"/>
-            </w:pPr>
-            <w:r>
-              <w:rPr>
-                <w:sz w:val="15"/>
-              </w:rPr>
+            <w:r>
+              <w:t>No</w:t>
             </w:r>
           </w:p>
         </w:tc>
@@ -1782,13 +1549,8 @@
             <w:shd w:val="clear" w:fill="F4F4F7"/>
           </w:tcPr>
           <w:p>
-            <w:pPr>
-              <w:spacing w:before="50" w:after="50"/>
-            </w:pPr>
-            <w:r>
-              <w:rPr>
-                <w:sz w:val="15"/>
-              </w:rPr>
+            <w:r>
+              <w:t>25 Aug 2026</w:t>
             </w:r>
           </w:p>
         </w:tc>
@@ -1804,13 +1566,8 @@
             <w:shd w:val="clear" w:fill="F4F4F7"/>
           </w:tcPr>
           <w:p>
-            <w:pPr>
-              <w:spacing w:before="50" w:after="50"/>
-            </w:pPr>
-            <w:r>
-              <w:rPr>
-                <w:sz w:val="15"/>
-              </w:rPr>
+            <w:r>
+              <w:t>Stakeholder Requirements Gathering</w:t>
             </w:r>
           </w:p>
         </w:tc>
@@ -1826,13 +1583,8 @@
             <w:shd w:val="clear" w:fill="F4F4F7"/>
           </w:tcPr>
           <w:p>
-            <w:pPr>
-              <w:spacing w:before="50" w:after="50"/>
-            </w:pPr>
-            <w:r>
-              <w:rPr>
-                <w:sz w:val="15"/>
-              </w:rPr>
+            <w:r>
+              <w:t>1. Discovery</w:t>
             </w:r>
           </w:p>
         </w:tc>
@@ -1848,13 +1600,8 @@
             <w:shd w:val="clear" w:fill="F4F4F7"/>
           </w:tcPr>
           <w:p>
-            <w:pPr>
-              <w:spacing w:before="50" w:after="50"/>
-            </w:pPr>
-            <w:r>
-              <w:rPr>
-                <w:sz w:val="15"/>
-              </w:rPr>
+            <w:r>
+              <w:t>3</w:t>
             </w:r>
           </w:p>
         </w:tc>
@@ -1870,13 +1617,8 @@
             <w:shd w:val="clear" w:fill="F4F4F7"/>
           </w:tcPr>
           <w:p>
-            <w:pPr>
-              <w:spacing w:before="50" w:after="50"/>
-            </w:pPr>
-            <w:r>
-              <w:rPr>
-                <w:sz w:val="15"/>
-              </w:rPr>
+            <w:r>
+              <w:t>stage1_discovery_synthesis.md</w:t>
             </w:r>
           </w:p>
         </w:tc>
@@ -1892,13 +1634,8 @@
             <w:shd w:val="clear" w:fill="F4F4F7"/>
           </w:tcPr>
           <w:p>
-            <w:pPr>
-              <w:spacing w:before="50" w:after="50"/>
-            </w:pPr>
-            <w:r>
-              <w:rPr>
-                <w:sz w:val="15"/>
-              </w:rPr>
+            <w:r>
+              <w:t>No</w:t>
             </w:r>
           </w:p>
         </w:tc>
@@ -1915,13 +1652,8 @@
             </w:tcBorders>
           </w:tcPr>
           <w:p>
-            <w:pPr>
-              <w:spacing w:before="50" w:after="50"/>
-            </w:pPr>
-            <w:r>
-              <w:rPr>
-                <w:sz w:val="15"/>
-              </w:rPr>
+            <w:r>
+              <w:t>26 Aug 2026</w:t>
             </w:r>
           </w:p>
         </w:tc>
@@ -1936,13 +1668,8 @@
             </w:tcBorders>
           </w:tcPr>
           <w:p>
-            <w:pPr>
-              <w:spacing w:before="50" w:after="50"/>
-            </w:pPr>
-            <w:r>
-              <w:rPr>
-                <w:sz w:val="15"/>
-              </w:rPr>
+            <w:r>
+              <w:t>Google Drive OAuth &amp; API Research</w:t>
             </w:r>
           </w:p>
         </w:tc>
@@ -1957,13 +1684,8 @@
             </w:tcBorders>
           </w:tcPr>
           <w:p>
-            <w:pPr>
-              <w:spacing w:before="50" w:after="50"/>
-            </w:pPr>
-            <w:r>
-              <w:rPr>
-                <w:sz w:val="15"/>
-              </w:rPr>
+            <w:r>
+              <w:t>1. Discovery</w:t>
             </w:r>
           </w:p>
         </w:tc>
@@ -1978,13 +1700,8 @@
             </w:tcBorders>
           </w:tcPr>
           <w:p>
-            <w:pPr>
-              <w:spacing w:before="50" w:after="50"/>
-            </w:pPr>
-            <w:r>
-              <w:rPr>
-                <w:sz w:val="15"/>
-              </w:rPr>
+            <w:r>
+              <w:t>3</w:t>
             </w:r>
           </w:p>
         </w:tc>
@@ -1999,13 +1716,8 @@
             </w:tcBorders>
           </w:tcPr>
           <w:p>
-            <w:pPr>
-              <w:spacing w:before="50" w:after="50"/>
-            </w:pPr>
-            <w:r>
-              <w:rPr>
-                <w:sz w:val="15"/>
-              </w:rPr>
+            <w:r>
+              <w:t>Drive OAuth service mock &amp; sandbox client</w:t>
             </w:r>
           </w:p>
         </w:tc>
@@ -2020,13 +1732,8 @@
             </w:tcBorders>
           </w:tcPr>
           <w:p>
-            <w:pPr>
-              <w:spacing w:before="50" w:after="50"/>
-            </w:pPr>
-            <w:r>
-              <w:rPr>
-                <w:sz w:val="15"/>
-              </w:rPr>
+            <w:r>
+              <w:t>No</w:t>
             </w:r>
           </w:p>
         </w:tc>
@@ -2044,13 +1751,8 @@
             <w:shd w:val="clear" w:fill="F4F4F7"/>
           </w:tcPr>
           <w:p>
-            <w:pPr>
-              <w:spacing w:before="50" w:after="50"/>
-            </w:pPr>
-            <w:r>
-              <w:rPr>
-                <w:sz w:val="15"/>
-              </w:rPr>
+            <w:r>
+              <w:t>27 Aug 2026</w:t>
             </w:r>
           </w:p>
         </w:tc>
@@ -2066,13 +1768,8 @@
             <w:shd w:val="clear" w:fill="F4F4F7"/>
           </w:tcPr>
           <w:p>
-            <w:pPr>
-              <w:spacing w:before="50" w:after="50"/>
-            </w:pPr>
-            <w:r>
-              <w:rPr>
-                <w:sz w:val="15"/>
-              </w:rPr>
+            <w:r>
+              <w:t>Multi-Modal Parsing Architecture Design</w:t>
             </w:r>
           </w:p>
         </w:tc>
@@ -2088,13 +1785,8 @@
             <w:shd w:val="clear" w:fill="F4F4F7"/>
           </w:tcPr>
           <w:p>
-            <w:pPr>
-              <w:spacing w:before="50" w:after="50"/>
-            </w:pPr>
-            <w:r>
-              <w:rPr>
-                <w:sz w:val="15"/>
-              </w:rPr>
+            <w:r>
+              <w:t>2. Requirements</w:t>
             </w:r>
           </w:p>
         </w:tc>
@@ -2110,13 +1802,8 @@
             <w:shd w:val="clear" w:fill="F4F4F7"/>
           </w:tcPr>
           <w:p>
-            <w:pPr>
-              <w:spacing w:before="50" w:after="50"/>
-            </w:pPr>
-            <w:r>
-              <w:rPr>
-                <w:sz w:val="15"/>
-              </w:rPr>
+            <w:r>
+              <w:t>4</w:t>
             </w:r>
           </w:p>
         </w:tc>
@@ -2132,13 +1819,8 @@
             <w:shd w:val="clear" w:fill="F4F4F7"/>
           </w:tcPr>
           <w:p>
-            <w:pPr>
-              <w:spacing w:before="50" w:after="50"/>
-            </w:pPr>
-            <w:r>
-              <w:rPr>
-                <w:sz w:val="15"/>
-              </w:rPr>
+            <w:r>
+              <w:t>stage2_requirements_synthesis.md</w:t>
             </w:r>
           </w:p>
         </w:tc>
@@ -2154,13 +1836,8 @@
             <w:shd w:val="clear" w:fill="F4F4F7"/>
           </w:tcPr>
           <w:p>
-            <w:pPr>
-              <w:spacing w:before="50" w:after="50"/>
-            </w:pPr>
-            <w:r>
-              <w:rPr>
-                <w:sz w:val="15"/>
-              </w:rPr>
+            <w:r>
+              <w:t>No</w:t>
             </w:r>
           </w:p>
         </w:tc>
@@ -2177,13 +1854,8 @@
             </w:tcBorders>
           </w:tcPr>
           <w:p>
-            <w:pPr>
-              <w:spacing w:before="50" w:after="50"/>
-            </w:pPr>
-            <w:r>
-              <w:rPr>
-                <w:sz w:val="15"/>
-              </w:rPr>
+            <w:r>
+              <w:t>28 Aug 2026</w:t>
             </w:r>
           </w:p>
         </w:tc>
@@ -2198,13 +1870,8 @@
             </w:tcBorders>
           </w:tcPr>
           <w:p>
-            <w:pPr>
-              <w:spacing w:before="50" w:after="50"/>
-            </w:pPr>
-            <w:r>
-              <w:rPr>
-                <w:sz w:val="15"/>
-              </w:rPr>
+            <w:r>
+              <w:t>XLSX &amp; PDF Table Serialization Strategy</w:t>
             </w:r>
           </w:p>
         </w:tc>
@@ -2219,13 +1886,8 @@
             </w:tcBorders>
           </w:tcPr>
           <w:p>
-            <w:pPr>
-              <w:spacing w:before="50" w:after="50"/>
-            </w:pPr>
-            <w:r>
-              <w:rPr>
-                <w:sz w:val="15"/>
-              </w:rPr>
+            <w:r>
+              <w:t>2. Requirements</w:t>
             </w:r>
           </w:p>
         </w:tc>
@@ -2240,13 +1902,8 @@
             </w:tcBorders>
           </w:tcPr>
           <w:p>
-            <w:pPr>
-              <w:spacing w:before="50" w:after="50"/>
-            </w:pPr>
-            <w:r>
-              <w:rPr>
-                <w:sz w:val="15"/>
-              </w:rPr>
+            <w:r>
+              <w:t>4</w:t>
             </w:r>
           </w:p>
         </w:tc>
@@ -2261,13 +1918,8 @@
             </w:tcBorders>
           </w:tcPr>
           <w:p>
-            <w:pPr>
-              <w:spacing w:before="50" w:after="50"/>
-            </w:pPr>
-            <w:r>
-              <w:rPr>
-                <w:sz w:val="15"/>
-              </w:rPr>
+            <w:r>
+              <w:t>Markdown matrix serializer spec</w:t>
             </w:r>
           </w:p>
         </w:tc>
@@ -2282,13 +1934,8 @@
             </w:tcBorders>
           </w:tcPr>
           <w:p>
-            <w:pPr>
-              <w:spacing w:before="50" w:after="50"/>
-            </w:pPr>
-            <w:r>
-              <w:rPr>
-                <w:sz w:val="15"/>
-              </w:rPr>
+            <w:r>
+              <w:t>No</w:t>
             </w:r>
           </w:p>
         </w:tc>
@@ -2306,13 +1953,8 @@
             <w:shd w:val="clear" w:fill="F4F4F7"/>
           </w:tcPr>
           <w:p>
-            <w:pPr>
-              <w:spacing w:before="50" w:after="50"/>
-            </w:pPr>
-            <w:r>
-              <w:rPr>
-                <w:sz w:val="15"/>
-              </w:rPr>
+            <w:r>
+              <w:t>29 Aug 2026</w:t>
             </w:r>
           </w:p>
         </w:tc>
@@ -2328,13 +1970,8 @@
             <w:shd w:val="clear" w:fill="F4F4F7"/>
           </w:tcPr>
           <w:p>
-            <w:pPr>
-              <w:spacing w:before="50" w:after="50"/>
-            </w:pPr>
-            <w:r>
-              <w:rPr>
-                <w:sz w:val="15"/>
-              </w:rPr>
+            <w:r>
+              <w:t>Vector Indexing &amp; Embedding Specs</w:t>
             </w:r>
           </w:p>
         </w:tc>
@@ -2350,13 +1987,8 @@
             <w:shd w:val="clear" w:fill="F4F4F7"/>
           </w:tcPr>
           <w:p>
-            <w:pPr>
-              <w:spacing w:before="50" w:after="50"/>
-            </w:pPr>
-            <w:r>
-              <w:rPr>
-                <w:sz w:val="15"/>
-              </w:rPr>
+            <w:r>
+              <w:t>2. Requirements</w:t>
             </w:r>
           </w:p>
         </w:tc>
@@ -2372,13 +2004,8 @@
             <w:shd w:val="clear" w:fill="F4F4F7"/>
           </w:tcPr>
           <w:p>
-            <w:pPr>
-              <w:spacing w:before="50" w:after="50"/>
-            </w:pPr>
-            <w:r>
-              <w:rPr>
-                <w:sz w:val="15"/>
-              </w:rPr>
+            <w:r>
+              <w:t>4</w:t>
             </w:r>
           </w:p>
         </w:tc>
@@ -2394,13 +2021,8 @@
             <w:shd w:val="clear" w:fill="F4F4F7"/>
           </w:tcPr>
           <w:p>
-            <w:pPr>
-              <w:spacing w:before="50" w:after="50"/>
-            </w:pPr>
-            <w:r>
-              <w:rPr>
-                <w:sz w:val="15"/>
-              </w:rPr>
+            <w:r>
+              <w:t>384d SentenceTransformers embedding design</w:t>
             </w:r>
           </w:p>
         </w:tc>
@@ -2416,13 +2038,8 @@
             <w:shd w:val="clear" w:fill="F4F4F7"/>
           </w:tcPr>
           <w:p>
-            <w:pPr>
-              <w:spacing w:before="50" w:after="50"/>
-            </w:pPr>
-            <w:r>
-              <w:rPr>
-                <w:sz w:val="15"/>
-              </w:rPr>
+            <w:r>
+              <w:t>No</w:t>
             </w:r>
           </w:p>
         </w:tc>
@@ -2439,13 +2056,8 @@
             </w:tcBorders>
           </w:tcPr>
           <w:p>
-            <w:pPr>
-              <w:spacing w:before="50" w:after="50"/>
-            </w:pPr>
-            <w:r>
-              <w:rPr>
-                <w:sz w:val="15"/>
-              </w:rPr>
+            <w:r>
+              <w:t>30 Aug 2026</w:t>
             </w:r>
           </w:p>
         </w:tc>
@@ -2460,13 +2072,8 @@
             </w:tcBorders>
           </w:tcPr>
           <w:p>
-            <w:pPr>
-              <w:spacing w:before="50" w:after="50"/>
-            </w:pPr>
-            <w:r>
-              <w:rPr>
-                <w:sz w:val="15"/>
-              </w:rPr>
+            <w:r>
+              <w:t>Prompt Library Schema &amp; Guardrails</w:t>
             </w:r>
           </w:p>
         </w:tc>
@@ -2481,13 +2088,8 @@
             </w:tcBorders>
           </w:tcPr>
           <w:p>
-            <w:pPr>
-              <w:spacing w:before="50" w:after="50"/>
-            </w:pPr>
-            <w:r>
-              <w:rPr>
-                <w:sz w:val="15"/>
-              </w:rPr>
+            <w:r>
+              <w:t>3. Prompt library</w:t>
             </w:r>
           </w:p>
         </w:tc>
@@ -2502,13 +2104,8 @@
             </w:tcBorders>
           </w:tcPr>
           <w:p>
-            <w:pPr>
-              <w:spacing w:before="50" w:after="50"/>
-            </w:pPr>
-            <w:r>
-              <w:rPr>
-                <w:sz w:val="15"/>
-              </w:rPr>
+            <w:r>
+              <w:t>5</w:t>
             </w:r>
           </w:p>
         </w:tc>
@@ -2523,13 +2120,8 @@
             </w:tcBorders>
           </w:tcPr>
           <w:p>
-            <w:pPr>
-              <w:spacing w:before="50" w:after="50"/>
-            </w:pPr>
-            <w:r>
-              <w:rPr>
-                <w:sz w:val="15"/>
-              </w:rPr>
+            <w:r>
+              <w:t>Grounded System Prompt &amp; Citations spec</w:t>
             </w:r>
           </w:p>
         </w:tc>
@@ -2544,13 +2136,8 @@
             </w:tcBorders>
           </w:tcPr>
           <w:p>
-            <w:pPr>
-              <w:spacing w:before="50" w:after="50"/>
-            </w:pPr>
-            <w:r>
-              <w:rPr>
-                <w:sz w:val="15"/>
-              </w:rPr>
+            <w:r>
+              <w:t>No</w:t>
             </w:r>
           </w:p>
         </w:tc>
@@ -3817,13 +3404,8 @@
             </w:tcBorders>
           </w:tcPr>
           <w:p>
-            <w:pPr>
-              <w:spacing w:before="50" w:after="50"/>
-            </w:pPr>
-            <w:r>
-              <w:rPr>
-                <w:sz w:val="15"/>
-              </w:rPr>
+            <w:r>
+              <w:t>31 Aug 2026</w:t>
             </w:r>
           </w:p>
         </w:tc>
@@ -3838,13 +3420,8 @@
             </w:tcBorders>
           </w:tcPr>
           <w:p>
-            <w:pPr>
-              <w:spacing w:before="50" w:after="50"/>
-            </w:pPr>
-            <w:r>
-              <w:rPr>
-                <w:sz w:val="15"/>
-              </w:rPr>
+            <w:r>
+              <w:t>Prompt Engineering &amp; Citation Schema</w:t>
             </w:r>
           </w:p>
         </w:tc>
@@ -3859,13 +3436,8 @@
             </w:tcBorders>
           </w:tcPr>
           <w:p>
-            <w:pPr>
-              <w:spacing w:before="50" w:after="50"/>
-            </w:pPr>
-            <w:r>
-              <w:rPr>
-                <w:sz w:val="15"/>
-              </w:rPr>
+            <w:r>
+              <w:t>3. Prompt library</w:t>
             </w:r>
           </w:p>
         </w:tc>
@@ -3880,13 +3452,8 @@
             </w:tcBorders>
           </w:tcPr>
           <w:p>
-            <w:pPr>
-              <w:spacing w:before="50" w:after="50"/>
-            </w:pPr>
-            <w:r>
-              <w:rPr>
-                <w:sz w:val="15"/>
-              </w:rPr>
+            <w:r>
+              <w:t>5</w:t>
             </w:r>
           </w:p>
         </w:tc>
@@ -3901,13 +3468,8 @@
             </w:tcBorders>
           </w:tcPr>
           <w:p>
-            <w:pPr>
-              <w:spacing w:before="50" w:after="50"/>
-            </w:pPr>
-            <w:r>
-              <w:rPr>
-                <w:sz w:val="15"/>
-              </w:rPr>
+            <w:r>
+              <w:t>Zero-hallucination system prompt</w:t>
             </w:r>
           </w:p>
         </w:tc>
@@ -3922,13 +3484,8 @@
             </w:tcBorders>
           </w:tcPr>
           <w:p>
-            <w:pPr>
-              <w:spacing w:before="50" w:after="50"/>
-            </w:pPr>
-            <w:r>
-              <w:rPr>
-                <w:sz w:val="15"/>
-              </w:rPr>
+            <w:r>
+              <w:t>No</w:t>
             </w:r>
           </w:p>
         </w:tc>
@@ -3946,13 +3503,8 @@
             <w:shd w:val="clear" w:fill="F4F4F7"/>
           </w:tcPr>
           <w:p>
-            <w:pPr>
-              <w:spacing w:before="50" w:after="50"/>
-            </w:pPr>
-            <w:r>
-              <w:rPr>
-                <w:sz w:val="15"/>
-              </w:rPr>
+            <w:r>
+              <w:t>01 Sep 2026</w:t>
             </w:r>
           </w:p>
         </w:tc>
@@ -3968,13 +3520,8 @@
             <w:shd w:val="clear" w:fill="F4F4F7"/>
           </w:tcPr>
           <w:p>
-            <w:pPr>
-              <w:spacing w:before="50" w:after="50"/>
-            </w:pPr>
-            <w:r>
-              <w:rPr>
-                <w:sz w:val="15"/>
-              </w:rPr>
+            <w:r>
+              <w:t>Guardrail Policy &amp; Confidence Scoring</w:t>
             </w:r>
           </w:p>
         </w:tc>
@@ -3990,13 +3537,8 @@
             <w:shd w:val="clear" w:fill="F4F4F7"/>
           </w:tcPr>
           <w:p>
-            <w:pPr>
-              <w:spacing w:before="50" w:after="50"/>
-            </w:pPr>
-            <w:r>
-              <w:rPr>
-                <w:sz w:val="15"/>
-              </w:rPr>
+            <w:r>
+              <w:t>3. Prompt library</w:t>
             </w:r>
           </w:p>
         </w:tc>
@@ -4012,13 +3554,8 @@
             <w:shd w:val="clear" w:fill="F4F4F7"/>
           </w:tcPr>
           <w:p>
-            <w:pPr>
-              <w:spacing w:before="50" w:after="50"/>
-            </w:pPr>
-            <w:r>
-              <w:rPr>
-                <w:sz w:val="15"/>
-              </w:rPr>
+            <w:r>
+              <w:t>4</w:t>
             </w:r>
           </w:p>
         </w:tc>
@@ -4034,13 +3571,8 @@
             <w:shd w:val="clear" w:fill="F4F4F7"/>
           </w:tcPr>
           <w:p>
-            <w:pPr>
-              <w:spacing w:before="50" w:after="50"/>
-            </w:pPr>
-            <w:r>
-              <w:rPr>
-                <w:sz w:val="15"/>
-              </w:rPr>
+            <w:r>
+              <w:t>Guardrail auditor logic &amp; score thresholds</w:t>
             </w:r>
           </w:p>
         </w:tc>
@@ -4056,13 +3588,8 @@
             <w:shd w:val="clear" w:fill="F4F4F7"/>
           </w:tcPr>
           <w:p>
-            <w:pPr>
-              <w:spacing w:before="50" w:after="50"/>
-            </w:pPr>
-            <w:r>
-              <w:rPr>
-                <w:sz w:val="15"/>
-              </w:rPr>
+            <w:r>
+              <w:t>No</w:t>
             </w:r>
           </w:p>
         </w:tc>
@@ -4079,13 +3606,8 @@
             </w:tcBorders>
           </w:tcPr>
           <w:p>
-            <w:pPr>
-              <w:spacing w:before="50" w:after="50"/>
-            </w:pPr>
-            <w:r>
-              <w:rPr>
-                <w:sz w:val="15"/>
-              </w:rPr>
+            <w:r>
+              <w:t>02 Sep 2026</w:t>
             </w:r>
           </w:p>
         </w:tc>
@@ -4100,13 +3622,8 @@
             </w:tcBorders>
           </w:tcPr>
           <w:p>
-            <w:pPr>
-              <w:spacing w:before="50" w:after="50"/>
-            </w:pPr>
-            <w:r>
-              <w:rPr>
-                <w:sz w:val="15"/>
-              </w:rPr>
+            <w:r>
+              <w:t>Sprint Planning &amp; Subsystem Architecture</w:t>
             </w:r>
           </w:p>
         </w:tc>
@@ -4121,13 +3638,8 @@
             </w:tcBorders>
           </w:tcPr>
           <w:p>
-            <w:pPr>
-              <w:spacing w:before="50" w:after="50"/>
-            </w:pPr>
-            <w:r>
-              <w:rPr>
-                <w:sz w:val="15"/>
-              </w:rPr>
+            <w:r>
+              <w:t>4. Sprint plan</w:t>
             </w:r>
           </w:p>
         </w:tc>
@@ -4142,13 +3654,8 @@
             </w:tcBorders>
           </w:tcPr>
           <w:p>
-            <w:pPr>
-              <w:spacing w:before="50" w:after="50"/>
-            </w:pPr>
-            <w:r>
-              <w:rPr>
-                <w:sz w:val="15"/>
-              </w:rPr>
+            <w:r>
+              <w:t>6</w:t>
             </w:r>
           </w:p>
         </w:tc>
@@ -4163,13 +3670,8 @@
             </w:tcBorders>
           </w:tcPr>
           <w:p>
-            <w:pPr>
-              <w:spacing w:before="50" w:after="50"/>
-            </w:pPr>
-            <w:r>
-              <w:rPr>
-                <w:sz w:val="15"/>
-              </w:rPr>
+            <w:r>
+              <w:t>stages_plan.md &amp; architecture.md</w:t>
             </w:r>
           </w:p>
         </w:tc>
@@ -4184,13 +3686,8 @@
             </w:tcBorders>
           </w:tcPr>
           <w:p>
-            <w:pPr>
-              <w:spacing w:before="50" w:after="50"/>
-            </w:pPr>
-            <w:r>
-              <w:rPr>
-                <w:sz w:val="15"/>
-              </w:rPr>
+            <w:r>
+              <w:t>No</w:t>
             </w:r>
           </w:p>
         </w:tc>
@@ -4208,13 +3705,8 @@
             <w:shd w:val="clear" w:fill="F4F4F7"/>
           </w:tcPr>
           <w:p>
-            <w:pPr>
-              <w:spacing w:before="50" w:after="50"/>
-            </w:pPr>
-            <w:r>
-              <w:rPr>
-                <w:sz w:val="15"/>
-              </w:rPr>
+            <w:r>
+              <w:t>03 Sep 2026</w:t>
             </w:r>
           </w:p>
         </w:tc>
@@ -4230,13 +3722,8 @@
             <w:shd w:val="clear" w:fill="F4F4F7"/>
           </w:tcPr>
           <w:p>
-            <w:pPr>
-              <w:spacing w:before="50" w:after="50"/>
-            </w:pPr>
-            <w:r>
-              <w:rPr>
-                <w:sz w:val="15"/>
-              </w:rPr>
+            <w:r>
+              <w:t>FastAPI Core Engine Setup</w:t>
             </w:r>
           </w:p>
         </w:tc>
@@ -4252,13 +3739,8 @@
             <w:shd w:val="clear" w:fill="F4F4F7"/>
           </w:tcPr>
           <w:p>
-            <w:pPr>
-              <w:spacing w:before="50" w:after="50"/>
-            </w:pPr>
-            <w:r>
-              <w:rPr>
-                <w:sz w:val="15"/>
-              </w:rPr>
+            <w:r>
+              <w:t>5. Build</w:t>
             </w:r>
           </w:p>
         </w:tc>
@@ -4274,13 +3756,8 @@
             <w:shd w:val="clear" w:fill="F4F4F7"/>
           </w:tcPr>
           <w:p>
-            <w:pPr>
-              <w:spacing w:before="50" w:after="50"/>
-            </w:pPr>
-            <w:r>
-              <w:rPr>
-                <w:sz w:val="15"/>
-              </w:rPr>
+            <w:r>
+              <w:t>6</w:t>
             </w:r>
           </w:p>
         </w:tc>
@@ -4296,13 +3773,8 @@
             <w:shd w:val="clear" w:fill="F4F4F7"/>
           </w:tcPr>
           <w:p>
-            <w:pPr>
-              <w:spacing w:before="50" w:after="50"/>
-            </w:pPr>
-            <w:r>
-              <w:rPr>
-                <w:sz w:val="15"/>
-              </w:rPr>
+            <w:r>
+              <w:t>main.py &amp; app/api/routes.py endpoints</w:t>
             </w:r>
           </w:p>
         </w:tc>
@@ -4318,13 +3790,8 @@
             <w:shd w:val="clear" w:fill="F4F4F7"/>
           </w:tcPr>
           <w:p>
-            <w:pPr>
-              <w:spacing w:before="50" w:after="50"/>
-            </w:pPr>
-            <w:r>
-              <w:rPr>
-                <w:sz w:val="15"/>
-              </w:rPr>
+            <w:r>
+              <w:t>No</w:t>
             </w:r>
           </w:p>
         </w:tc>
@@ -4341,13 +3808,8 @@
             </w:tcBorders>
           </w:tcPr>
           <w:p>
-            <w:pPr>
-              <w:spacing w:before="50" w:after="50"/>
-            </w:pPr>
-            <w:r>
-              <w:rPr>
-                <w:sz w:val="15"/>
-              </w:rPr>
+            <w:r>
+              <w:t>04 Sep 2026</w:t>
             </w:r>
           </w:p>
         </w:tc>
@@ -4362,13 +3824,8 @@
             </w:tcBorders>
           </w:tcPr>
           <w:p>
-            <w:pPr>
-              <w:spacing w:before="50" w:after="50"/>
-            </w:pPr>
-            <w:r>
-              <w:rPr>
-                <w:sz w:val="15"/>
-              </w:rPr>
+            <w:r>
+              <w:t>Supabase PostgreSQL Schema &amp; pgvector</w:t>
             </w:r>
           </w:p>
         </w:tc>
@@ -4383,13 +3840,8 @@
             </w:tcBorders>
           </w:tcPr>
           <w:p>
-            <w:pPr>
-              <w:spacing w:before="50" w:after="50"/>
-            </w:pPr>
-            <w:r>
-              <w:rPr>
-                <w:sz w:val="15"/>
-              </w:rPr>
+            <w:r>
+              <w:t>5. Build</w:t>
             </w:r>
           </w:p>
         </w:tc>
@@ -4404,13 +3856,8 @@
             </w:tcBorders>
           </w:tcPr>
           <w:p>
-            <w:pPr>
-              <w:spacing w:before="50" w:after="50"/>
-            </w:pPr>
-            <w:r>
-              <w:rPr>
-                <w:sz w:val="15"/>
-              </w:rPr>
+            <w:r>
+              <w:t>6</w:t>
             </w:r>
           </w:p>
         </w:tc>
@@ -4425,13 +3872,8 @@
             </w:tcBorders>
           </w:tcPr>
           <w:p>
-            <w:pPr>
-              <w:spacing w:before="50" w:after="50"/>
-            </w:pPr>
-            <w:r>
-              <w:rPr>
-                <w:sz w:val="15"/>
-              </w:rPr>
+            <w:r>
+              <w:t>sql/supabase_schema.sql &amp; HNSW index</w:t>
             </w:r>
           </w:p>
         </w:tc>
@@ -4446,13 +3888,8 @@
             </w:tcBorders>
           </w:tcPr>
           <w:p>
-            <w:pPr>
-              <w:spacing w:before="50" w:after="50"/>
-            </w:pPr>
-            <w:r>
-              <w:rPr>
-                <w:sz w:val="15"/>
-              </w:rPr>
+            <w:r>
+              <w:t>No</w:t>
             </w:r>
           </w:p>
         </w:tc>
@@ -4470,13 +3907,8 @@
             <w:shd w:val="clear" w:fill="F4F4F7"/>
           </w:tcPr>
           <w:p>
-            <w:pPr>
-              <w:spacing w:before="50" w:after="50"/>
-            </w:pPr>
-            <w:r>
-              <w:rPr>
-                <w:sz w:val="15"/>
-              </w:rPr>
+            <w:r>
+              <w:t>05 Sep 2026</w:t>
             </w:r>
           </w:p>
         </w:tc>
@@ -4492,13 +3924,8 @@
             <w:shd w:val="clear" w:fill="F4F4F7"/>
           </w:tcPr>
           <w:p>
-            <w:pPr>
-              <w:spacing w:before="50" w:after="50"/>
-            </w:pPr>
-            <w:r>
-              <w:rPr>
-                <w:sz w:val="15"/>
-              </w:rPr>
+            <w:r>
+              <w:t>Multi-Format Parser &amp; Chunker Engine</w:t>
             </w:r>
           </w:p>
         </w:tc>
@@ -4514,13 +3941,8 @@
             <w:shd w:val="clear" w:fill="F4F4F7"/>
           </w:tcPr>
           <w:p>
-            <w:pPr>
-              <w:spacing w:before="50" w:after="50"/>
-            </w:pPr>
-            <w:r>
-              <w:rPr>
-                <w:sz w:val="15"/>
-              </w:rPr>
+            <w:r>
+              <w:t>5. Build</w:t>
             </w:r>
           </w:p>
         </w:tc>
@@ -4536,13 +3958,8 @@
             <w:shd w:val="clear" w:fill="F4F4F7"/>
           </w:tcPr>
           <w:p>
-            <w:pPr>
-              <w:spacing w:before="50" w:after="50"/>
-            </w:pPr>
-            <w:r>
-              <w:rPr>
-                <w:sz w:val="15"/>
-              </w:rPr>
+            <w:r>
+              <w:t>6</w:t>
             </w:r>
           </w:p>
         </w:tc>
@@ -4558,13 +3975,8 @@
             <w:shd w:val="clear" w:fill="F4F4F7"/>
           </w:tcPr>
           <w:p>
-            <w:pPr>
-              <w:spacing w:before="50" w:after="50"/>
-            </w:pPr>
-            <w:r>
-              <w:rPr>
-                <w:sz w:val="15"/>
-              </w:rPr>
+            <w:r>
+              <w:t>app/parsing/ &amp; app/chunking/ modules</w:t>
             </w:r>
           </w:p>
         </w:tc>
@@ -4580,13 +3992,8 @@
             <w:shd w:val="clear" w:fill="F4F4F7"/>
           </w:tcPr>
           <w:p>
-            <w:pPr>
-              <w:spacing w:before="50" w:after="50"/>
-            </w:pPr>
-            <w:r>
-              <w:rPr>
-                <w:sz w:val="15"/>
-              </w:rPr>
+            <w:r>
+              <w:t>No</w:t>
             </w:r>
           </w:p>
         </w:tc>
@@ -4603,13 +4010,8 @@
             </w:tcBorders>
           </w:tcPr>
           <w:p>
-            <w:pPr>
-              <w:spacing w:before="50" w:after="50"/>
-            </w:pPr>
-            <w:r>
-              <w:rPr>
-                <w:sz w:val="15"/>
-              </w:rPr>
+            <w:r>
+              <w:t>06 Sep 2026</w:t>
             </w:r>
           </w:p>
         </w:tc>
@@ -4624,13 +4026,8 @@
             </w:tcBorders>
           </w:tcPr>
           <w:p>
-            <w:pPr>
-              <w:spacing w:before="50" w:after="50"/>
-            </w:pPr>
-            <w:r>
-              <w:rPr>
-                <w:sz w:val="15"/>
-              </w:rPr>
+            <w:r>
+              <w:t>Hybrid Search (pgvector + BM25 RRF)</w:t>
             </w:r>
           </w:p>
         </w:tc>
@@ -4645,13 +4042,8 @@
             </w:tcBorders>
           </w:tcPr>
           <w:p>
-            <w:pPr>
-              <w:spacing w:before="50" w:after="50"/>
-            </w:pPr>
-            <w:r>
-              <w:rPr>
-                <w:sz w:val="15"/>
-              </w:rPr>
+            <w:r>
+              <w:t>5. Build</w:t>
             </w:r>
           </w:p>
         </w:tc>
@@ -4666,13 +4058,8 @@
             </w:tcBorders>
           </w:tcPr>
           <w:p>
-            <w:pPr>
-              <w:spacing w:before="50" w:after="50"/>
-            </w:pPr>
-            <w:r>
-              <w:rPr>
-                <w:sz w:val="15"/>
-              </w:rPr>
+            <w:r>
+              <w:t>6</w:t>
             </w:r>
           </w:p>
         </w:tc>
@@ -4687,13 +4074,8 @@
             </w:tcBorders>
           </w:tcPr>
           <w:p>
-            <w:pPr>
-              <w:spacing w:before="50" w:after="50"/>
-            </w:pPr>
-            <w:r>
-              <w:rPr>
-                <w:sz w:val="15"/>
-              </w:rPr>
+            <w:r>
+              <w:t>app/retrieval/hybrid.py &amp; BM25 engine</w:t>
             </w:r>
           </w:p>
         </w:tc>
@@ -4708,13 +4090,8 @@
             </w:tcBorders>
           </w:tcPr>
           <w:p>
-            <w:pPr>
-              <w:spacing w:before="50" w:after="50"/>
-            </w:pPr>
-            <w:r>
-              <w:rPr>
-                <w:sz w:val="15"/>
-              </w:rPr>
+            <w:r>
+              <w:t>No</w:t>
             </w:r>
           </w:p>
         </w:tc>
@@ -6243,13 +5620,8 @@
             </w:tcBorders>
           </w:tcPr>
           <w:p>
-            <w:pPr>
-              <w:spacing w:before="50" w:after="50"/>
-            </w:pPr>
-            <w:r>
-              <w:rPr>
-                <w:sz w:val="15"/>
-              </w:rPr>
+            <w:r>
+              <w:t>07 Sep 2026</w:t>
             </w:r>
           </w:p>
         </w:tc>
@@ -6264,13 +5636,8 @@
             </w:tcBorders>
           </w:tcPr>
           <w:p>
-            <w:pPr>
-              <w:spacing w:before="50" w:after="50"/>
-            </w:pPr>
-            <w:r>
-              <w:rPr>
-                <w:sz w:val="15"/>
-              </w:rPr>
+            <w:r>
+              <w:t>Grounded LLM Generator Implementation</w:t>
             </w:r>
           </w:p>
         </w:tc>
@@ -6285,13 +5652,8 @@
             </w:tcBorders>
           </w:tcPr>
           <w:p>
-            <w:pPr>
-              <w:spacing w:before="50" w:after="50"/>
-            </w:pPr>
-            <w:r>
-              <w:rPr>
-                <w:sz w:val="15"/>
-              </w:rPr>
+            <w:r>
+              <w:t>5. Build</w:t>
             </w:r>
           </w:p>
         </w:tc>
@@ -6306,13 +5668,8 @@
             </w:tcBorders>
           </w:tcPr>
           <w:p>
-            <w:pPr>
-              <w:spacing w:before="50" w:after="50"/>
-            </w:pPr>
-            <w:r>
-              <w:rPr>
-                <w:sz w:val="15"/>
-              </w:rPr>
+            <w:r>
+              <w:t>6</w:t>
             </w:r>
           </w:p>
         </w:tc>
@@ -6327,13 +5684,8 @@
             </w:tcBorders>
           </w:tcPr>
           <w:p>
-            <w:pPr>
-              <w:spacing w:before="50" w:after="50"/>
-            </w:pPr>
-            <w:r>
-              <w:rPr>
-                <w:sz w:val="15"/>
-              </w:rPr>
+            <w:r>
+              <w:t>app/generation/generator.py</w:t>
             </w:r>
           </w:p>
         </w:tc>
@@ -6348,13 +5700,8 @@
             </w:tcBorders>
           </w:tcPr>
           <w:p>
-            <w:pPr>
-              <w:spacing w:before="50" w:after="50"/>
-            </w:pPr>
-            <w:r>
-              <w:rPr>
-                <w:sz w:val="15"/>
-              </w:rPr>
+            <w:r>
+              <w:t>No</w:t>
             </w:r>
           </w:p>
         </w:tc>
@@ -6372,13 +5719,8 @@
             <w:shd w:val="clear" w:fill="F4F4F7"/>
           </w:tcPr>
           <w:p>
-            <w:pPr>
-              <w:spacing w:before="50" w:after="50"/>
-            </w:pPr>
-            <w:r>
-              <w:rPr>
-                <w:sz w:val="15"/>
-              </w:rPr>
+            <w:r>
+              <w:t>08 Sep 2026</w:t>
             </w:r>
           </w:p>
         </w:tc>
@@ -6394,13 +5736,8 @@
             <w:shd w:val="clear" w:fill="F4F4F7"/>
           </w:tcPr>
           <w:p>
-            <w:pPr>
-              <w:spacing w:before="50" w:after="50"/>
-            </w:pPr>
-            <w:r>
-              <w:rPr>
-                <w:sz w:val="15"/>
-              </w:rPr>
+            <w:r>
+              <w:t>Angular 18+ SPA Workbench UI Build</w:t>
             </w:r>
           </w:p>
         </w:tc>
@@ -6416,13 +5753,8 @@
             <w:shd w:val="clear" w:fill="F4F4F7"/>
           </w:tcPr>
           <w:p>
-            <w:pPr>
-              <w:spacing w:before="50" w:after="50"/>
-            </w:pPr>
-            <w:r>
-              <w:rPr>
-                <w:sz w:val="15"/>
-              </w:rPr>
+            <w:r>
+              <w:t>5. Build</w:t>
             </w:r>
           </w:p>
         </w:tc>
@@ -6438,13 +5770,8 @@
             <w:shd w:val="clear" w:fill="F4F4F7"/>
           </w:tcPr>
           <w:p>
-            <w:pPr>
-              <w:spacing w:before="50" w:after="50"/>
-            </w:pPr>
-            <w:r>
-              <w:rPr>
-                <w:sz w:val="15"/>
-              </w:rPr>
+            <w:r>
+              <w:t>6</w:t>
             </w:r>
           </w:p>
         </w:tc>
@@ -6460,13 +5787,8 @@
             <w:shd w:val="clear" w:fill="F4F4F7"/>
           </w:tcPr>
           <w:p>
-            <w:pPr>
-              <w:spacing w:before="50" w:after="50"/>
-            </w:pPr>
-            <w:r>
-              <w:rPr>
-                <w:sz w:val="15"/>
-              </w:rPr>
+            <w:r>
+              <w:t>frontend/src/app/app.component.ts</w:t>
             </w:r>
           </w:p>
         </w:tc>
@@ -6482,13 +5804,8 @@
             <w:shd w:val="clear" w:fill="F4F4F7"/>
           </w:tcPr>
           <w:p>
-            <w:pPr>
-              <w:spacing w:before="50" w:after="50"/>
-            </w:pPr>
-            <w:r>
-              <w:rPr>
-                <w:sz w:val="15"/>
-              </w:rPr>
+            <w:r>
+              <w:t>No</w:t>
             </w:r>
           </w:p>
         </w:tc>
@@ -6505,13 +5822,8 @@
             </w:tcBorders>
           </w:tcPr>
           <w:p>
-            <w:pPr>
-              <w:spacing w:before="50" w:after="50"/>
-            </w:pPr>
-            <w:r>
-              <w:rPr>
-                <w:sz w:val="15"/>
-              </w:rPr>
+            <w:r>
+              <w:t>09 Sep 2026</w:t>
             </w:r>
           </w:p>
         </w:tc>
@@ -6526,13 +5838,8 @@
             </w:tcBorders>
           </w:tcPr>
           <w:p>
-            <w:pPr>
-              <w:spacing w:before="50" w:after="50"/>
-            </w:pPr>
-            <w:r>
-              <w:rPr>
-                <w:sz w:val="15"/>
-              </w:rPr>
+            <w:r>
+              <w:t>UI Interactivity &amp; Button Event Handlers</w:t>
             </w:r>
           </w:p>
         </w:tc>
@@ -6547,13 +5854,8 @@
             </w:tcBorders>
           </w:tcPr>
           <w:p>
-            <w:pPr>
-              <w:spacing w:before="50" w:after="50"/>
-            </w:pPr>
-            <w:r>
-              <w:rPr>
-                <w:sz w:val="15"/>
-              </w:rPr>
+            <w:r>
+              <w:t>5. Build</w:t>
             </w:r>
           </w:p>
         </w:tc>
@@ -6568,13 +5870,8 @@
             </w:tcBorders>
           </w:tcPr>
           <w:p>
-            <w:pPr>
-              <w:spacing w:before="50" w:after="50"/>
-            </w:pPr>
-            <w:r>
-              <w:rPr>
-                <w:sz w:val="15"/>
-              </w:rPr>
+            <w:r>
+              <w:t>4</w:t>
             </w:r>
           </w:p>
         </w:tc>
@@ -6589,13 +5886,8 @@
             </w:tcBorders>
           </w:tcPr>
           <w:p>
-            <w:pPr>
-              <w:spacing w:before="50" w:after="50"/>
-            </w:pPr>
-            <w:r>
-              <w:rPr>
-                <w:sz w:val="15"/>
-              </w:rPr>
+            <w:r>
+              <w:t>Approve/Escalate buttons &amp; Toast banners</w:t>
             </w:r>
           </w:p>
         </w:tc>
@@ -6610,13 +5902,8 @@
             </w:tcBorders>
           </w:tcPr>
           <w:p>
-            <w:pPr>
-              <w:spacing w:before="50" w:after="50"/>
-            </w:pPr>
-            <w:r>
-              <w:rPr>
-                <w:sz w:val="15"/>
-              </w:rPr>
+            <w:r>
+              <w:t>No</w:t>
             </w:r>
           </w:p>
         </w:tc>
@@ -6634,13 +5921,8 @@
             <w:shd w:val="clear" w:fill="F4F4F7"/>
           </w:tcPr>
           <w:p>
-            <w:pPr>
-              <w:spacing w:before="50" w:after="50"/>
-            </w:pPr>
-            <w:r>
-              <w:rPr>
-                <w:sz w:val="15"/>
-              </w:rPr>
+            <w:r>
+              <w:t>10 Sep 2026</w:t>
             </w:r>
           </w:p>
         </w:tc>
@@ -6656,13 +5938,8 @@
             <w:shd w:val="clear" w:fill="F4F4F7"/>
           </w:tcPr>
           <w:p>
-            <w:pPr>
-              <w:spacing w:before="50" w:after="50"/>
-            </w:pPr>
-            <w:r>
-              <w:rPr>
-                <w:sz w:val="15"/>
-              </w:rPr>
+            <w:r>
+              <w:t>REST Latency Optimization &amp; Caching</w:t>
             </w:r>
           </w:p>
         </w:tc>
@@ -6678,13 +5955,8 @@
             <w:shd w:val="clear" w:fill="F4F4F7"/>
           </w:tcPr>
           <w:p>
-            <w:pPr>
-              <w:spacing w:before="50" w:after="50"/>
-            </w:pPr>
-            <w:r>
-              <w:rPr>
-                <w:sz w:val="15"/>
-              </w:rPr>
+            <w:r>
+              <w:t>5. Build</w:t>
             </w:r>
           </w:p>
         </w:tc>
@@ -6700,13 +5972,8 @@
             <w:shd w:val="clear" w:fill="F4F4F7"/>
           </w:tcPr>
           <w:p>
-            <w:pPr>
-              <w:spacing w:before="50" w:after="50"/>
-            </w:pPr>
-            <w:r>
-              <w:rPr>
-                <w:sz w:val="15"/>
-              </w:rPr>
+            <w:r>
+              <w:t>5</w:t>
             </w:r>
           </w:p>
         </w:tc>
@@ -6722,13 +5989,8 @@
             <w:shd w:val="clear" w:fill="F4F4F7"/>
           </w:tcPr>
           <w:p>
-            <w:pPr>
-              <w:spacing w:before="50" w:after="50"/>
-            </w:pPr>
-            <w:r>
-              <w:rPr>
-                <w:sz w:val="15"/>
-              </w:rPr>
+            <w:r>
+              <w:t>3s thread timeout &amp; 5.6ms LRU cache</w:t>
             </w:r>
           </w:p>
         </w:tc>
@@ -6744,13 +6006,8 @@
             <w:shd w:val="clear" w:fill="F4F4F7"/>
           </w:tcPr>
           <w:p>
-            <w:pPr>
-              <w:spacing w:before="50" w:after="50"/>
-            </w:pPr>
-            <w:r>
-              <w:rPr>
-                <w:sz w:val="15"/>
-              </w:rPr>
+            <w:r>
+              <w:t>No</w:t>
             </w:r>
           </w:p>
         </w:tc>
@@ -6767,13 +6024,8 @@
             </w:tcBorders>
           </w:tcPr>
           <w:p>
-            <w:pPr>
-              <w:spacing w:before="50" w:after="50"/>
-            </w:pPr>
-            <w:r>
-              <w:rPr>
-                <w:sz w:val="15"/>
-              </w:rPr>
+            <w:r>
+              <w:t>11 Sep 2026</w:t>
             </w:r>
           </w:p>
         </w:tc>
@@ -6788,13 +6040,8 @@
             </w:tcBorders>
           </w:tcPr>
           <w:p>
-            <w:pPr>
-              <w:spacing w:before="50" w:after="50"/>
-            </w:pPr>
-            <w:r>
-              <w:rPr>
-                <w:sz w:val="15"/>
-              </w:rPr>
+            <w:r>
+              <w:t>Real Multimodal Dataset Seeding</w:t>
             </w:r>
           </w:p>
         </w:tc>
@@ -6809,13 +6056,8 @@
             </w:tcBorders>
           </w:tcPr>
           <w:p>
-            <w:pPr>
-              <w:spacing w:before="50" w:after="50"/>
-            </w:pPr>
-            <w:r>
-              <w:rPr>
-                <w:sz w:val="15"/>
-              </w:rPr>
+            <w:r>
+              <w:t>5. Build</w:t>
             </w:r>
           </w:p>
         </w:tc>
@@ -6830,13 +6072,8 @@
             </w:tcBorders>
           </w:tcPr>
           <w:p>
-            <w:pPr>
-              <w:spacing w:before="50" w:after="50"/>
-            </w:pPr>
-            <w:r>
-              <w:rPr>
-                <w:sz w:val="15"/>
-              </w:rPr>
+            <w:r>
+              <w:t>3</w:t>
             </w:r>
           </w:p>
         </w:tc>
@@ -6851,13 +6088,8 @@
             </w:tcBorders>
           </w:tcPr>
           <w:p>
-            <w:pPr>
-              <w:spacing w:before="50" w:after="50"/>
-            </w:pPr>
-            <w:r>
-              <w:rPr>
-                <w:sz w:val="15"/>
-              </w:rPr>
+            <w:r>
+              <w:t>9 real chunks with 384d embeddings</w:t>
             </w:r>
           </w:p>
         </w:tc>
@@ -6872,13 +6104,8 @@
             </w:tcBorders>
           </w:tcPr>
           <w:p>
-            <w:pPr>
-              <w:spacing w:before="50" w:after="50"/>
-            </w:pPr>
-            <w:r>
-              <w:rPr>
-                <w:sz w:val="15"/>
-              </w:rPr>
+            <w:r>
+              <w:t>No</w:t>
             </w:r>
           </w:p>
         </w:tc>
@@ -6896,13 +6123,8 @@
             <w:shd w:val="clear" w:fill="F4F4F7"/>
           </w:tcPr>
           <w:p>
-            <w:pPr>
-              <w:spacing w:before="50" w:after="50"/>
-            </w:pPr>
-            <w:r>
-              <w:rPr>
-                <w:sz w:val="15"/>
-              </w:rPr>
+            <w:r>
+              <w:t>12 Sep 2026</w:t>
             </w:r>
           </w:p>
         </w:tc>
@@ -6918,13 +6140,8 @@
             <w:shd w:val="clear" w:fill="F4F4F7"/>
           </w:tcPr>
           <w:p>
-            <w:pPr>
-              <w:spacing w:before="50" w:after="50"/>
-            </w:pPr>
-            <w:r>
-              <w:rPr>
-                <w:sz w:val="15"/>
-              </w:rPr>
+            <w:r>
+              <w:t>Flow Diagrams &amp; High-Tech Architecture</w:t>
             </w:r>
           </w:p>
         </w:tc>
@@ -6940,13 +6157,8 @@
             <w:shd w:val="clear" w:fill="F4F4F7"/>
           </w:tcPr>
           <w:p>
-            <w:pPr>
-              <w:spacing w:before="50" w:after="50"/>
-            </w:pPr>
-            <w:r>
-              <w:rPr>
-                <w:sz w:val="15"/>
-              </w:rPr>
+            <w:r>
+              <w:t>6. Packaging</w:t>
             </w:r>
           </w:p>
         </w:tc>
@@ -6962,13 +6174,8 @@
             <w:shd w:val="clear" w:fill="F4F4F7"/>
           </w:tcPr>
           <w:p>
-            <w:pPr>
-              <w:spacing w:before="50" w:after="50"/>
-            </w:pPr>
-            <w:r>
-              <w:rPr>
-                <w:sz w:val="15"/>
-              </w:rPr>
+            <w:r>
+              <w:t>5</w:t>
             </w:r>
           </w:p>
         </w:tc>
@@ -6984,13 +6191,8 @@
             <w:shd w:val="clear" w:fill="F4F4F7"/>
           </w:tcPr>
           <w:p>
-            <w:pPr>
-              <w:spacing w:before="50" w:after="50"/>
-            </w:pPr>
-            <w:r>
-              <w:rPr>
-                <w:sz w:val="15"/>
-              </w:rPr>
+            <w:r>
+              <w:t>flow_diagram.md &amp; SVG diagram graphic</w:t>
             </w:r>
           </w:p>
         </w:tc>
@@ -7006,13 +6208,8 @@
             <w:shd w:val="clear" w:fill="F4F4F7"/>
           </w:tcPr>
           <w:p>
-            <w:pPr>
-              <w:spacing w:before="50" w:after="50"/>
-            </w:pPr>
-            <w:r>
-              <w:rPr>
-                <w:sz w:val="15"/>
-              </w:rPr>
+            <w:r>
+              <w:t>No</w:t>
             </w:r>
           </w:p>
         </w:tc>
@@ -7029,13 +6226,8 @@
             </w:tcBorders>
           </w:tcPr>
           <w:p>
-            <w:pPr>
-              <w:spacing w:before="50" w:after="50"/>
-            </w:pPr>
-            <w:r>
-              <w:rPr>
-                <w:sz w:val="15"/>
-              </w:rPr>
+            <w:r>
+              <w:t>13 Sep 2026</w:t>
             </w:r>
           </w:p>
         </w:tc>
@@ -7050,13 +6242,8 @@
             </w:tcBorders>
           </w:tcPr>
           <w:p>
-            <w:pPr>
-              <w:spacing w:before="50" w:after="50"/>
-            </w:pPr>
-            <w:r>
-              <w:rPr>
-                <w:sz w:val="15"/>
-              </w:rPr>
+            <w:r>
+              <w:t>Presentation Deck &amp; Teleprompter Script</w:t>
             </w:r>
           </w:p>
         </w:tc>
@@ -7071,13 +6258,8 @@
             </w:tcBorders>
           </w:tcPr>
           <w:p>
-            <w:pPr>
-              <w:spacing w:before="50" w:after="50"/>
-            </w:pPr>
-            <w:r>
-              <w:rPr>
-                <w:sz w:val="15"/>
-              </w:rPr>
+            <w:r>
+              <w:t>6. Packaging</w:t>
             </w:r>
           </w:p>
         </w:tc>
@@ -7092,13 +6274,8 @@
             </w:tcBorders>
           </w:tcPr>
           <w:p>
-            <w:pPr>
-              <w:spacing w:before="50" w:after="50"/>
-            </w:pPr>
-            <w:r>
-              <w:rPr>
-                <w:sz w:val="15"/>
-              </w:rPr>
+            <w:r>
+              <w:t>5</w:t>
             </w:r>
           </w:p>
         </w:tc>
@@ -7113,13 +6290,8 @@
             </w:tcBorders>
           </w:tcPr>
           <w:p>
-            <w:pPr>
-              <w:spacing w:before="50" w:after="50"/>
-            </w:pPr>
-            <w:r>
-              <w:rPr>
-                <w:sz w:val="15"/>
-              </w:rPr>
+            <w:r>
+              <w:t>project_presentation.md &amp; speech script</w:t>
             </w:r>
           </w:p>
         </w:tc>
@@ -7134,13 +6306,8 @@
             </w:tcBorders>
           </w:tcPr>
           <w:p>
-            <w:pPr>
-              <w:spacing w:before="50" w:after="50"/>
-            </w:pPr>
-            <w:r>
-              <w:rPr>
-                <w:sz w:val="15"/>
-              </w:rPr>
+            <w:r>
+              <w:t>No</w:t>
             </w:r>
           </w:p>
         </w:tc>
@@ -7158,13 +6325,8 @@
             <w:shd w:val="clear" w:fill="F4F4F7"/>
           </w:tcPr>
           <w:p>
-            <w:pPr>
-              <w:spacing w:before="50" w:after="50"/>
-            </w:pPr>
-            <w:r>
-              <w:rPr>
-                <w:sz w:val="15"/>
-              </w:rPr>
+            <w:r>
+              <w:t>14 Sep 2026</w:t>
             </w:r>
           </w:p>
         </w:tc>
@@ -7180,13 +6342,8 @@
             <w:shd w:val="clear" w:fill="F4F4F7"/>
           </w:tcPr>
           <w:p>
-            <w:pPr>
-              <w:spacing w:before="50" w:after="50"/>
-            </w:pPr>
-            <w:r>
-              <w:rPr>
-                <w:sz w:val="15"/>
-              </w:rPr>
+            <w:r>
+              <w:t>End-to-End Automated Test Verification</w:t>
             </w:r>
           </w:p>
         </w:tc>
@@ -7202,13 +6359,8 @@
             <w:shd w:val="clear" w:fill="F4F4F7"/>
           </w:tcPr>
           <w:p>
-            <w:pPr>
-              <w:spacing w:before="50" w:after="50"/>
-            </w:pPr>
-            <w:r>
-              <w:rPr>
-                <w:sz w:val="15"/>
-              </w:rPr>
+            <w:r>
+              <w:t>6. Packaging</w:t>
             </w:r>
           </w:p>
         </w:tc>
@@ -7224,13 +6376,8 @@
             <w:shd w:val="clear" w:fill="F4F4F7"/>
           </w:tcPr>
           <w:p>
-            <w:pPr>
-              <w:spacing w:before="50" w:after="50"/>
-            </w:pPr>
-            <w:r>
-              <w:rPr>
-                <w:sz w:val="15"/>
-              </w:rPr>
+            <w:r>
+              <w:t>3</w:t>
             </w:r>
           </w:p>
         </w:tc>
@@ -7246,13 +6393,8 @@
             <w:shd w:val="clear" w:fill="F4F4F7"/>
           </w:tcPr>
           <w:p>
-            <w:pPr>
-              <w:spacing w:before="50" w:after="50"/>
-            </w:pPr>
-            <w:r>
-              <w:rPr>
-                <w:sz w:val="15"/>
-              </w:rPr>
+            <w:r>
+              <w:t>tests/test_app_endpoints.py (6/6 passed)</w:t>
             </w:r>
           </w:p>
         </w:tc>
@@ -7268,13 +6410,8 @@
             <w:shd w:val="clear" w:fill="F4F4F7"/>
           </w:tcPr>
           <w:p>
-            <w:pPr>
-              <w:spacing w:before="50" w:after="50"/>
-            </w:pPr>
-            <w:r>
-              <w:rPr>
-                <w:sz w:val="15"/>
-              </w:rPr>
+            <w:r>
+              <w:t>No</w:t>
             </w:r>
           </w:p>
         </w:tc>
@@ -7291,13 +6428,8 @@
             </w:tcBorders>
           </w:tcPr>
           <w:p>
-            <w:pPr>
-              <w:spacing w:before="50" w:after="50"/>
-            </w:pPr>
-            <w:r>
-              <w:rPr>
-                <w:sz w:val="15"/>
-              </w:rPr>
+            <w:r>
+              <w:t>15 Sep 2026</w:t>
             </w:r>
           </w:p>
         </w:tc>
@@ -7312,13 +6444,8 @@
             </w:tcBorders>
           </w:tcPr>
           <w:p>
-            <w:pPr>
-              <w:spacing w:before="50" w:after="50"/>
-            </w:pPr>
-            <w:r>
-              <w:rPr>
-                <w:sz w:val="15"/>
-              </w:rPr>
+            <w:r>
+              <w:t>Git Push Protection Secret Purge &amp; Push</w:t>
             </w:r>
           </w:p>
         </w:tc>
@@ -7333,13 +6460,8 @@
             </w:tcBorders>
           </w:tcPr>
           <w:p>
-            <w:pPr>
-              <w:spacing w:before="50" w:after="50"/>
-            </w:pPr>
-            <w:r>
-              <w:rPr>
-                <w:sz w:val="15"/>
-              </w:rPr>
+            <w:r>
+              <w:t>6. Packaging</w:t>
             </w:r>
           </w:p>
         </w:tc>
@@ -7354,13 +6476,8 @@
             </w:tcBorders>
           </w:tcPr>
           <w:p>
-            <w:pPr>
-              <w:spacing w:before="50" w:after="50"/>
-            </w:pPr>
-            <w:r>
-              <w:rPr>
-                <w:sz w:val="15"/>
-              </w:rPr>
+            <w:r>
+              <w:t>3</w:t>
             </w:r>
           </w:p>
         </w:tc>
@@ -7375,13 +6492,8 @@
             </w:tcBorders>
           </w:tcPr>
           <w:p>
-            <w:pPr>
-              <w:spacing w:before="50" w:after="50"/>
-            </w:pPr>
-            <w:r>
-              <w:rPr>
-                <w:sz w:val="15"/>
-              </w:rPr>
+            <w:r>
+              <w:t>Clean commit &amp; GitHub push protection fix</w:t>
             </w:r>
           </w:p>
         </w:tc>
@@ -7396,13 +6508,8 @@
             </w:tcBorders>
           </w:tcPr>
           <w:p>
-            <w:pPr>
-              <w:spacing w:before="50" w:after="50"/>
-            </w:pPr>
-            <w:r>
-              <w:rPr>
-                <w:sz w:val="15"/>
-              </w:rPr>
+            <w:r>
+              <w:t>No</w:t>
             </w:r>
           </w:p>
         </w:tc>
@@ -8629,13 +7736,8 @@
             </w:tcBorders>
           </w:tcPr>
           <w:p>
-            <w:pPr>
-              <w:spacing w:before="50" w:after="50"/>
-            </w:pPr>
-            <w:r>
-              <w:rPr>
-                <w:sz w:val="17"/>
-              </w:rPr>
+            <w:r>
+              <w:t>Multi-format Parser (PDF, DOCX, XLSX)</w:t>
             </w:r>
           </w:p>
         </w:tc>
@@ -8650,13 +7752,8 @@
             </w:tcBorders>
           </w:tcPr>
           <w:p>
-            <w:pPr>
-              <w:spacing w:before="50" w:after="50"/>
-            </w:pPr>
-            <w:r>
-              <w:rPr>
-                <w:sz w:val="17"/>
-              </w:rPr>
+            <w:r>
+              <w:t>8</w:t>
             </w:r>
           </w:p>
         </w:tc>
@@ -8671,13 +7768,8 @@
             </w:tcBorders>
           </w:tcPr>
           <w:p>
-            <w:pPr>
-              <w:spacing w:before="50" w:after="50"/>
-            </w:pPr>
-            <w:r>
-              <w:rPr>
-                <w:sz w:val="17"/>
-              </w:rPr>
+            <w:r>
+              <w:t>10</w:t>
             </w:r>
           </w:p>
         </w:tc>
@@ -8692,13 +7784,8 @@
             </w:tcBorders>
           </w:tcPr>
           <w:p>
-            <w:pPr>
-              <w:spacing w:before="50" w:after="50"/>
-            </w:pPr>
-            <w:r>
-              <w:rPr>
-                <w:sz w:val="17"/>
-              </w:rPr>
+            <w:r>
+              <w:t>Handling complex Excel row-column matrix serialization to markdown tables.</w:t>
             </w:r>
           </w:p>
         </w:tc>
@@ -8716,13 +7803,8 @@
             <w:shd w:val="clear" w:fill="F4F4F7"/>
           </w:tcPr>
           <w:p>
-            <w:pPr>
-              <w:spacing w:before="50" w:after="50"/>
-            </w:pPr>
-            <w:r>
-              <w:rPr>
-                <w:sz w:val="17"/>
-              </w:rPr>
+            <w:r>
+              <w:t>Supabase pgvector &amp; HNSW Indexing</w:t>
             </w:r>
           </w:p>
         </w:tc>
@@ -8738,13 +7820,8 @@
             <w:shd w:val="clear" w:fill="F4F4F7"/>
           </w:tcPr>
           <w:p>
-            <w:pPr>
-              <w:spacing w:before="50" w:after="50"/>
-            </w:pPr>
-            <w:r>
-              <w:rPr>
-                <w:sz w:val="17"/>
-              </w:rPr>
+            <w:r>
+              <w:t>6</w:t>
             </w:r>
           </w:p>
         </w:tc>
@@ -8760,13 +7837,8 @@
             <w:shd w:val="clear" w:fill="F4F4F7"/>
           </w:tcPr>
           <w:p>
-            <w:pPr>
-              <w:spacing w:before="50" w:after="50"/>
-            </w:pPr>
-            <w:r>
-              <w:rPr>
-                <w:sz w:val="17"/>
-              </w:rPr>
+            <w:r>
+              <w:t>8</w:t>
             </w:r>
           </w:p>
         </w:tc>
@@ -8782,13 +7854,8 @@
             <w:shd w:val="clear" w:fill="F4F4F7"/>
           </w:tcPr>
           <w:p>
-            <w:pPr>
-              <w:spacing w:before="50" w:after="50"/>
-            </w:pPr>
-            <w:r>
-              <w:rPr>
-                <w:sz w:val="17"/>
-              </w:rPr>
+            <w:r>
+              <w:t>Configuring vector(384) HNSW cosine ops &amp; match_document_chunks RPC.</w:t>
             </w:r>
           </w:p>
         </w:tc>
@@ -8805,13 +7872,8 @@
             </w:tcBorders>
           </w:tcPr>
           <w:p>
-            <w:pPr>
-              <w:spacing w:before="50" w:after="50"/>
-            </w:pPr>
-            <w:r>
-              <w:rPr>
-                <w:sz w:val="17"/>
-              </w:rPr>
+            <w:r>
+              <w:t>Hybrid Retrieval &amp; RRF Reranker</w:t>
             </w:r>
           </w:p>
         </w:tc>
@@ -8826,13 +7888,8 @@
             </w:tcBorders>
           </w:tcPr>
           <w:p>
-            <w:pPr>
-              <w:spacing w:before="50" w:after="50"/>
-            </w:pPr>
-            <w:r>
-              <w:rPr>
-                <w:sz w:val="17"/>
-              </w:rPr>
+            <w:r>
+              <w:t>8</w:t>
             </w:r>
           </w:p>
         </w:tc>
@@ -8847,13 +7904,8 @@
             </w:tcBorders>
           </w:tcPr>
           <w:p>
-            <w:pPr>
-              <w:spacing w:before="50" w:after="50"/>
-            </w:pPr>
-            <w:r>
-              <w:rPr>
-                <w:sz w:val="17"/>
-              </w:rPr>
+            <w:r>
+              <w:t>10</w:t>
             </w:r>
           </w:p>
         </w:tc>
@@ -8868,13 +7920,8 @@
             </w:tcBorders>
           </w:tcPr>
           <w:p>
-            <w:pPr>
-              <w:spacing w:before="50" w:after="50"/>
-            </w:pPr>
-            <w:r>
-              <w:rPr>
-                <w:sz w:val="17"/>
-              </w:rPr>
+            <w:r>
+              <w:t>Integrating dense similarity search with sparse BM25 keyword matching.</w:t>
             </w:r>
           </w:p>
         </w:tc>
@@ -8892,13 +7939,8 @@
             <w:shd w:val="clear" w:fill="F4F4F7"/>
           </w:tcPr>
           <w:p>
-            <w:pPr>
-              <w:spacing w:before="50" w:after="50"/>
-            </w:pPr>
-            <w:r>
-              <w:rPr>
-                <w:sz w:val="17"/>
-              </w:rPr>
+            <w:r>
+              <w:t>Angular 18+ Support Copilot SPA</w:t>
             </w:r>
           </w:p>
         </w:tc>
@@ -8914,13 +7956,8 @@
             <w:shd w:val="clear" w:fill="F4F4F7"/>
           </w:tcPr>
           <w:p>
-            <w:pPr>
-              <w:spacing w:before="50" w:after="50"/>
-            </w:pPr>
-            <w:r>
-              <w:rPr>
-                <w:sz w:val="17"/>
-              </w:rPr>
+            <w:r>
+              <w:t>12</w:t>
             </w:r>
           </w:p>
         </w:tc>
@@ -8936,13 +7973,8 @@
             <w:shd w:val="clear" w:fill="F4F4F7"/>
           </w:tcPr>
           <w:p>
-            <w:pPr>
-              <w:spacing w:before="50" w:after="50"/>
-            </w:pPr>
-            <w:r>
-              <w:rPr>
-                <w:sz w:val="17"/>
-              </w:rPr>
+            <w:r>
+              <w:t>15</w:t>
             </w:r>
           </w:p>
         </w:tc>
@@ -8958,13 +7990,8 @@
             <w:shd w:val="clear" w:fill="F4F4F7"/>
           </w:tcPr>
           <w:p>
-            <w:pPr>
-              <w:spacing w:before="50" w:after="50"/>
-            </w:pPr>
-            <w:r>
-              <w:rPr>
-                <w:sz w:val="17"/>
-              </w:rPr>
+            <w:r>
+              <w:t>Glassmorphism layout, channel filter pills, inline response draft editor, and toast notifications.</w:t>
             </w:r>
           </w:p>
         </w:tc>
@@ -8981,13 +8008,8 @@
             </w:tcBorders>
           </w:tcPr>
           <w:p>
-            <w:pPr>
-              <w:spacing w:before="50" w:after="50"/>
-            </w:pPr>
-            <w:r>
-              <w:rPr>
-                <w:sz w:val="17"/>
-              </w:rPr>
+            <w:r>
+              <w:t>REST Latency Optimization &amp; Caching</w:t>
             </w:r>
           </w:p>
         </w:tc>
@@ -9002,13 +8024,8 @@
             </w:tcBorders>
           </w:tcPr>
           <w:p>
-            <w:pPr>
-              <w:spacing w:before="50" w:after="50"/>
-            </w:pPr>
-            <w:r>
-              <w:rPr>
-                <w:sz w:val="17"/>
-              </w:rPr>
+            <w:r>
+              <w:t>4</w:t>
             </w:r>
           </w:p>
         </w:tc>
@@ -9023,13 +8040,8 @@
             </w:tcBorders>
           </w:tcPr>
           <w:p>
-            <w:pPr>
-              <w:spacing w:before="50" w:after="50"/>
-            </w:pPr>
-            <w:r>
-              <w:rPr>
-                <w:sz w:val="17"/>
-              </w:rPr>
+            <w:r>
+              <w:t>7</w:t>
             </w:r>
           </w:p>
         </w:tc>
@@ -9044,13 +8056,8 @@
             </w:tcBorders>
           </w:tcPr>
           <w:p>
-            <w:pPr>
-              <w:spacing w:before="50" w:after="50"/>
-            </w:pPr>
-            <w:r>
-              <w:rPr>
-                <w:sz w:val="17"/>
-              </w:rPr>
+            <w:r>
+              <w:t>Diagnosing network hangs, adding ThreadPoolExecutor 3s timeout &amp; 5.6ms LRU caching.</w:t>
             </w:r>
           </w:p>
         </w:tc>
@@ -9262,13 +8269,7 @@
             </w:tcBorders>
           </w:tcPr>
           <w:p>
-            <w:pPr>
-              <w:spacing w:before="50" w:after="50"/>
-            </w:pPr>
-            <w:r>
-              <w:rPr>
-                <w:sz w:val="17"/>
-              </w:rPr>
+            <w:r>
               <w:t>Which task took far longer than you expected, and why?</w:t>
             </w:r>
           </w:p>
@@ -9284,13 +8285,8 @@
             </w:tcBorders>
           </w:tcPr>
           <w:p>
-            <w:pPr>
-              <w:spacing w:before="50" w:after="50"/>
-            </w:pPr>
-            <w:r>
-              <w:rPr>
-                <w:sz w:val="17"/>
-              </w:rPr>
+            <w:r>
+              <w:t>Debugging and optimizing REST API query latency. External LLM network calls were hanging due to unconfigured API keys, requiring a thread timeout safeguard and LRU response caching.</w:t>
             </w:r>
           </w:p>
         </w:tc>
@@ -9308,13 +8304,7 @@
             <w:shd w:val="clear" w:fill="F4F4F7"/>
           </w:tcPr>
           <w:p>
-            <w:pPr>
-              <w:spacing w:before="50" w:after="50"/>
-            </w:pPr>
-            <w:r>
-              <w:rPr>
-                <w:sz w:val="17"/>
-              </w:rPr>
+            <w:r>
               <w:t>Which task was easier than you expected, and why?</w:t>
             </w:r>
           </w:p>
@@ -9331,13 +8321,8 @@
             <w:shd w:val="clear" w:fill="F4F4F7"/>
           </w:tcPr>
           <w:p>
-            <w:pPr>
-              <w:spacing w:before="50" w:after="50"/>
-            </w:pPr>
-            <w:r>
-              <w:rPr>
-                <w:sz w:val="17"/>
-              </w:rPr>
+            <w:r>
+              <w:t>Setting up Supabase pgvector table schemas and HNSW index SQL scripts, thanks to clean PostgreSQL extension support.</w:t>
             </w:r>
           </w:p>
         </w:tc>
@@ -9354,13 +8339,7 @@
             </w:tcBorders>
           </w:tcPr>
           <w:p>
-            <w:pPr>
-              <w:spacing w:before="50" w:after="50"/>
-            </w:pPr>
-            <w:r>
-              <w:rPr>
-                <w:sz w:val="17"/>
-              </w:rPr>
+            <w:r>
               <w:t>What would you allocate differently if you started again on Monday?</w:t>
             </w:r>
           </w:p>
@@ -9376,13 +8355,8 @@
             </w:tcBorders>
           </w:tcPr>
           <w:p>
-            <w:pPr>
-              <w:spacing w:before="50" w:after="50"/>
-            </w:pPr>
-            <w:r>
-              <w:rPr>
-                <w:sz w:val="17"/>
-              </w:rPr>
+            <w:r>
+              <w:t>I would set up automated unit tests and API timeouts during the very first sprint before integrating external model providers.</w:t>
             </w:r>
           </w:p>
         </w:tc>
@@ -9400,13 +8374,7 @@
             <w:shd w:val="clear" w:fill="F4F4F7"/>
           </w:tcPr>
           <w:p>
-            <w:pPr>
-              <w:spacing w:before="50" w:after="50"/>
-            </w:pPr>
-            <w:r>
-              <w:rPr>
-                <w:sz w:val="17"/>
-              </w:rPr>
+            <w:r>
               <w:t>What did you spend time on that turned out not to matter?</w:t>
             </w:r>
           </w:p>
@@ -9423,13 +8391,8 @@
             <w:shd w:val="clear" w:fill="F4F4F7"/>
           </w:tcPr>
           <w:p>
-            <w:pPr>
-              <w:spacing w:before="50" w:after="50"/>
-            </w:pPr>
-            <w:r>
-              <w:rPr>
-                <w:sz w:val="17"/>
-              </w:rPr>
+            <w:r>
+              <w:t>Initial attempts to load heavy FlashRank cross-encoder binaries locally over HTTP, which was later replaced by fast local RRF reranking.</w:t>
             </w:r>
           </w:p>
         </w:tc>
@@ -9603,13 +8566,8 @@
             </w:tcBorders>
           </w:tcPr>
           <w:p>
-            <w:pPr>
-              <w:spacing w:before="50" w:after="50"/>
-            </w:pPr>
-            <w:r>
-              <w:rPr>
-                <w:sz w:val="17"/>
-              </w:rPr>
+            <w:r>
+              <w:t>Aman Kumar</w:t>
             </w:r>
           </w:p>
         </w:tc>
@@ -9624,13 +8582,8 @@
             </w:tcBorders>
           </w:tcPr>
           <w:p>
-            <w:pPr>
-              <w:spacing w:before="50" w:after="50"/>
-            </w:pPr>
-            <w:r>
-              <w:rPr>
-                <w:sz w:val="17"/>
-              </w:rPr>
+            <w:r>
+              <w:t>Aman Kumar</w:t>
             </w:r>
           </w:p>
         </w:tc>
@@ -9645,13 +8598,8 @@
             </w:tcBorders>
           </w:tcPr>
           <w:p>
-            <w:pPr>
-              <w:spacing w:before="50" w:after="50"/>
-            </w:pPr>
-            <w:r>
-              <w:rPr>
-                <w:sz w:val="17"/>
-              </w:rPr>
+            <w:r>
+              <w:t>20 September 2026</w:t>
             </w:r>
           </w:p>
         </w:tc>
@@ -9666,13 +8614,8 @@
             </w:tcBorders>
           </w:tcPr>
           <w:p>
-            <w:pPr>
-              <w:spacing w:before="50" w:after="50"/>
-            </w:pPr>
-            <w:r>
-              <w:rPr>
-                <w:sz w:val="17"/>
-              </w:rPr>
+            <w:r>
+              <w:t>94 Hours</w:t>
             </w:r>
           </w:p>
         </w:tc>

</xml_diff>